<commit_message>
docs: satisfy portfolio state reference dependencies
</commit_message>
<xml_diff>
--- a/docs/IT-032-001 — Portfolio State Domain Model MVP.docx
+++ b/docs/IT-032-001 — Portfolio State Domain Model MVP.docx
@@ -1024,17 +1024,36 @@
         <w:rPr>
           <w:rtl w:val="0"/>
         </w:rPr>
-        <w:t xml:space="preserve">Este incremento depende exclusivamente de:</w:t>
-      </w:r>
-    </w:p>
-    <w:p>
-      <w:pPr>
-        <w:numPr>
-          <w:ilvl w:val="0"/>
-          <w:numId w:val="17"/>
-        </w:numPr>
-        <w:spacing w:after="0" w:afterAutospacing="0" w:before="240" w:lineRule="auto"/>
-        <w:ind w:left="720" w:hanging="360"/>
+        <w:t xml:space="preserve">Este incremento depende de:</w:t>
+      </w:r>
+    </w:p>
+    <w:p>
+      <w:pPr>
+        <w:spacing w:after="240" w:before="240" w:lineRule="auto"/>
+        <w:rPr/>
+      </w:pPr>
+      <w:r>
+        <w:rPr>
+          <w:rtl w:val="0"/>
+        </w:rPr>
+      </w:r>
+    </w:p>
+    <w:p>
+      <w:pPr>
+        <w:spacing w:after="240" w:before="240" w:lineRule="auto"/>
+        <w:rPr/>
+      </w:pPr>
+      <w:r>
+        <w:rPr>
+          <w:rtl w:val="0"/>
+        </w:rPr>
+        <w:t xml:space="preserve">DOC-000 — Índice Maestro de Arquitectura y Gobierno Documental.</w:t>
+      </w:r>
+    </w:p>
+    <w:p>
+      <w:pPr>
+        <w:spacing w:after="240" w:before="240" w:lineRule="auto"/>
+        <w:rPr/>
       </w:pPr>
       <w:r>
         <w:rPr>
@@ -1045,12 +1064,8 @@
     </w:p>
     <w:p>
       <w:pPr>
-        <w:numPr>
-          <w:ilvl w:val="0"/>
-          <w:numId w:val="17"/>
-        </w:numPr>
-        <w:spacing w:after="0" w:afterAutospacing="0" w:before="0" w:beforeAutospacing="0" w:lineRule="auto"/>
-        <w:ind w:left="720" w:hanging="360"/>
+        <w:spacing w:after="240" w:before="240" w:lineRule="auto"/>
+        <w:rPr/>
       </w:pPr>
       <w:r>
         <w:rPr>
@@ -1061,12 +1076,8 @@
     </w:p>
     <w:p>
       <w:pPr>
-        <w:numPr>
-          <w:ilvl w:val="0"/>
-          <w:numId w:val="17"/>
-        </w:numPr>
-        <w:spacing w:after="0" w:afterAutospacing="0" w:before="0" w:beforeAutospacing="0" w:lineRule="auto"/>
-        <w:ind w:left="720" w:hanging="360"/>
+        <w:spacing w:after="240" w:before="240" w:lineRule="auto"/>
+        <w:rPr/>
       </w:pPr>
       <w:r>
         <w:rPr>
@@ -1077,12 +1088,8 @@
     </w:p>
     <w:p>
       <w:pPr>
-        <w:numPr>
-          <w:ilvl w:val="0"/>
-          <w:numId w:val="17"/>
-        </w:numPr>
-        <w:spacing w:after="0" w:afterAutospacing="0" w:before="0" w:beforeAutospacing="0" w:lineRule="auto"/>
-        <w:ind w:left="720" w:hanging="360"/>
+        <w:spacing w:after="240" w:before="240" w:lineRule="auto"/>
+        <w:rPr/>
       </w:pPr>
       <w:r>
         <w:rPr>
@@ -1093,12 +1100,32 @@
     </w:p>
     <w:p>
       <w:pPr>
-        <w:numPr>
-          <w:ilvl w:val="0"/>
-          <w:numId w:val="17"/>
-        </w:numPr>
-        <w:spacing w:after="0" w:afterAutospacing="0" w:before="0" w:beforeAutospacing="0" w:lineRule="auto"/>
-        <w:ind w:left="720" w:hanging="360"/>
+        <w:spacing w:after="240" w:before="240" w:lineRule="auto"/>
+        <w:rPr/>
+      </w:pPr>
+      <w:r>
+        <w:rPr>
+          <w:rtl w:val="0"/>
+        </w:rPr>
+        <w:t xml:space="preserve">ADR-011 — Autorización Excepcional de Contratos Fundamentales de Identidad de Referencia.</w:t>
+      </w:r>
+    </w:p>
+    <w:p>
+      <w:pPr>
+        <w:spacing w:after="240" w:before="240" w:lineRule="auto"/>
+        <w:rPr/>
+      </w:pPr>
+      <w:r>
+        <w:rPr>
+          <w:rtl w:val="0"/>
+        </w:rPr>
+        <w:t xml:space="preserve">IT-REF-001 — Reference Identity Domain Contracts MVP.</w:t>
+      </w:r>
+    </w:p>
+    <w:p>
+      <w:pPr>
+        <w:spacing w:after="240" w:before="240" w:lineRule="auto"/>
+        <w:rPr/>
       </w:pPr>
       <w:r>
         <w:rPr>
@@ -1109,12 +1136,8 @@
     </w:p>
     <w:p>
       <w:pPr>
-        <w:numPr>
-          <w:ilvl w:val="0"/>
-          <w:numId w:val="17"/>
-        </w:numPr>
-        <w:spacing w:after="240" w:before="0" w:beforeAutospacing="0" w:lineRule="auto"/>
-        <w:ind w:left="720" w:hanging="360"/>
+        <w:spacing w:after="240" w:before="240" w:lineRule="auto"/>
+        <w:rPr/>
       </w:pPr>
       <w:r>
         <w:rPr>
@@ -1132,7 +1155,121 @@
         <w:rPr>
           <w:rtl w:val="0"/>
         </w:rPr>
+      </w:r>
+    </w:p>
+    <w:p>
+      <w:pPr>
+        <w:spacing w:after="240" w:before="240" w:lineRule="auto"/>
+        <w:rPr/>
+      </w:pPr>
+      <w:r>
+        <w:rPr>
+          <w:rtl w:val="0"/>
+        </w:rPr>
+        <w:t xml:space="preserve">Portfolio State utilizará:</w:t>
+      </w:r>
+    </w:p>
+    <w:p>
+      <w:pPr>
+        <w:spacing w:after="240" w:before="240" w:lineRule="auto"/>
+        <w:rPr/>
+      </w:pPr>
+      <w:r>
+        <w:rPr>
+          <w:rtl w:val="0"/>
+        </w:rPr>
+      </w:r>
+    </w:p>
+    <w:p>
+      <w:pPr>
+        <w:spacing w:after="240" w:before="240" w:lineRule="auto"/>
+        <w:rPr/>
+      </w:pPr>
+      <w:r>
+        <w:rPr>
+          <w:rtl w:val="0"/>
+        </w:rPr>
+        <w:t xml:space="preserve">InstrumentReference para identificar públicamente cada instrumento mantenido por una posición;</w:t>
+      </w:r>
+    </w:p>
+    <w:p>
+      <w:pPr>
+        <w:spacing w:after="240" w:before="240" w:lineRule="auto"/>
+        <w:rPr/>
+      </w:pPr>
+      <w:r>
+        <w:rPr>
+          <w:rtl w:val="0"/>
+        </w:rPr>
+        <w:t xml:space="preserve">CurrencyReference para identificar públicamente cada moneda correspondiente a una disponibilidad monetaria.</w:t>
+      </w:r>
+    </w:p>
+    <w:p>
+      <w:pPr>
+        <w:spacing w:after="240" w:before="240" w:lineRule="auto"/>
+        <w:rPr/>
+      </w:pPr>
+      <w:r>
+        <w:rPr>
+          <w:rtl w:val="0"/>
+        </w:rPr>
+      </w:r>
+    </w:p>
+    <w:p>
+      <w:pPr>
+        <w:spacing w:after="240" w:before="240" w:lineRule="auto"/>
+        <w:rPr/>
+      </w:pPr>
+      <w:r>
+        <w:rPr>
+          <w:rtl w:val="0"/>
+        </w:rPr>
+        <w:t xml:space="preserve">El presente incremento no redefine, extiende ni sustituye dichos contratos.</w:t>
+      </w:r>
+    </w:p>
+    <w:p>
+      <w:pPr>
+        <w:spacing w:after="240" w:before="240" w:lineRule="auto"/>
+        <w:rPr/>
+      </w:pPr>
+      <w:r>
+        <w:rPr>
+          <w:rtl w:val="0"/>
+        </w:rPr>
+      </w:r>
+    </w:p>
+    <w:p>
+      <w:pPr>
+        <w:spacing w:after="240" w:before="240" w:lineRule="auto"/>
+        <w:rPr/>
+      </w:pPr>
+      <w:r>
+        <w:rPr>
+          <w:rtl w:val="0"/>
+        </w:rPr>
         <w:t xml:space="preserve">No introduce dependencias adicionales.</w:t>
+      </w:r>
+    </w:p>
+    <w:p>
+      <w:pPr>
+        <w:spacing w:after="240" w:before="240" w:lineRule="auto"/>
+        <w:rPr/>
+      </w:pPr>
+      <w:r>
+        <w:rPr>
+          <w:rtl w:val="0"/>
+        </w:rPr>
+      </w:r>
+    </w:p>
+    <w:p>
+      <w:pPr>
+        <w:spacing w:after="240" w:before="240" w:lineRule="auto"/>
+        <w:rPr/>
+      </w:pPr>
+      <w:r>
+        <w:rPr>
+          <w:rtl w:val="0"/>
+        </w:rPr>
       </w:r>
     </w:p>
     <w:p>
@@ -2759,6 +2896,131 @@
       <w:pPr>
         <w:numPr>
           <w:ilvl w:val="0"/>
+          <w:numId w:val="15"/>
+        </w:numPr>
+        <w:spacing w:after="0" w:afterAutospacing="0" w:before="240" w:lineRule="auto"/>
+        <w:ind w:left="720" w:hanging="360"/>
+      </w:pPr>
+      <w:r>
+        <w:rPr>
+          <w:rtl w:val="0"/>
+        </w:rPr>
+        <w:t xml:space="preserve">algoritmos internos de Portfolio;</w:t>
+      </w:r>
+    </w:p>
+    <w:p>
+      <w:pPr>
+        <w:numPr>
+          <w:ilvl w:val="0"/>
+          <w:numId w:val="15"/>
+        </w:numPr>
+        <w:spacing w:after="0" w:afterAutospacing="0" w:before="0" w:beforeAutospacing="0" w:lineRule="auto"/>
+        <w:ind w:left="720" w:hanging="360"/>
+      </w:pPr>
+      <w:r>
+        <w:rPr>
+          <w:rtl w:val="0"/>
+        </w:rPr>
+        <w:t xml:space="preserve">implementaciones particulares;</w:t>
+      </w:r>
+    </w:p>
+    <w:p>
+      <w:pPr>
+        <w:numPr>
+          <w:ilvl w:val="0"/>
+          <w:numId w:val="15"/>
+        </w:numPr>
+        <w:spacing w:after="240" w:before="0" w:beforeAutospacing="0" w:lineRule="auto"/>
+        <w:ind w:left="720" w:hanging="360"/>
+      </w:pPr>
+      <w:r>
+        <w:rPr>
+          <w:rtl w:val="0"/>
+        </w:rPr>
+        <w:t xml:space="preserve">mecanismos privados.</w:t>
+      </w:r>
+    </w:p>
+    <w:p>
+      <w:pPr>
+        <w:spacing w:after="240" w:before="240" w:lineRule="auto"/>
+        <w:rPr/>
+      </w:pPr>
+      <w:r>
+        <w:rPr>
+          <w:rtl w:val="0"/>
+        </w:rPr>
+        <w:t xml:space="preserve">Toda interacción arquitectónica deberá realizarse exclusivamente mediante el contrato público implementado por este incremento.</w:t>
+      </w:r>
+    </w:p>
+    <w:p>
+      <w:pPr>
+        <w:rPr/>
+      </w:pPr>
+      <w:r>
+        <w:pict>
+          <v:rect style="width:0.0pt;height:1.5pt" o:hr="t" o:hrstd="t" o:hralign="center" fillcolor="#A0A0A0" stroked="f"/>
+        </w:pict>
+      </w:r>
+      <w:r>
+        <w:rPr>
+          <w:rtl w:val="0"/>
+        </w:rPr>
+      </w:r>
+    </w:p>
+    <w:p>
+      <w:pPr>
+        <w:pStyle w:val="Heading1"/>
+        <w:keepNext w:val="0"/>
+        <w:keepLines w:val="0"/>
+        <w:spacing w:before="480" w:lineRule="auto"/>
+        <w:rPr>
+          <w:b w:val="1"/>
+          <w:bCs w:val="1"/>
+          <w:sz w:val="46"/>
+          <w:szCs w:val="46"/>
+        </w:rPr>
+      </w:pPr>
+      <w:bookmarkStart w:colFirst="0" w:colLast="0" w:name="_2sp6rgda5ayh" w:id="14"/>
+      <w:bookmarkEnd w:id="14"/>
+      <w:r>
+        <w:rPr>
+          <w:b w:val="1"/>
+          <w:bCs w:val="1"/>
+          <w:sz w:val="46"/>
+          <w:szCs w:val="46"/>
+          <w:rtl w:val="0"/>
+        </w:rPr>
+        <w:t xml:space="preserve">13. Compatibilidad Arquitectónica</w:t>
+      </w:r>
+    </w:p>
+    <w:p>
+      <w:pPr>
+        <w:spacing w:after="240" w:before="240" w:lineRule="auto"/>
+        <w:rPr/>
+      </w:pPr>
+      <w:r>
+        <w:rPr>
+          <w:rtl w:val="0"/>
+        </w:rPr>
+        <w:t xml:space="preserve">El presente incremento preserva íntegramente las fronteras establecidas por DOC-032.</w:t>
+      </w:r>
+    </w:p>
+    <w:p>
+      <w:pPr>
+        <w:spacing w:after="240" w:before="240" w:lineRule="auto"/>
+        <w:rPr/>
+      </w:pPr>
+      <w:r>
+        <w:rPr>
+          <w:rtl w:val="0"/>
+        </w:rPr>
+        <w:t xml:space="preserve">No modifica:</w:t>
+      </w:r>
+    </w:p>
+    <w:p>
+      <w:pPr>
+        <w:numPr>
+          <w:ilvl w:val="0"/>
           <w:numId w:val="16"/>
         </w:numPr>
         <w:spacing w:after="0" w:afterAutospacing="0" w:before="240" w:lineRule="auto"/>
@@ -2768,7 +3030,7 @@
         <w:rPr>
           <w:rtl w:val="0"/>
         </w:rPr>
-        <w:t xml:space="preserve">algoritmos internos de Portfolio;</w:t>
+        <w:t xml:space="preserve">Decision Model;</w:t>
       </w:r>
     </w:p>
     <w:p>
@@ -2784,7 +3046,7 @@
         <w:rPr>
           <w:rtl w:val="0"/>
         </w:rPr>
-        <w:t xml:space="preserve">implementaciones particulares;</w:t>
+        <w:t xml:space="preserve">Risk;</w:t>
       </w:r>
     </w:p>
     <w:p>
@@ -2800,131 +3062,6 @@
         <w:rPr>
           <w:rtl w:val="0"/>
         </w:rPr>
-        <w:t xml:space="preserve">mecanismos privados.</w:t>
-      </w:r>
-    </w:p>
-    <w:p>
-      <w:pPr>
-        <w:spacing w:after="240" w:before="240" w:lineRule="auto"/>
-        <w:rPr/>
-      </w:pPr>
-      <w:r>
-        <w:rPr>
-          <w:rtl w:val="0"/>
-        </w:rPr>
-        <w:t xml:space="preserve">Toda interacción arquitectónica deberá realizarse exclusivamente mediante el contrato público implementado por este incremento.</w:t>
-      </w:r>
-    </w:p>
-    <w:p>
-      <w:pPr>
-        <w:rPr/>
-      </w:pPr>
-      <w:r>
-        <w:pict>
-          <v:rect style="width:0.0pt;height:1.5pt" o:hr="t" o:hrstd="t" o:hralign="center" fillcolor="#A0A0A0" stroked="f"/>
-        </w:pict>
-      </w:r>
-      <w:r>
-        <w:rPr>
-          <w:rtl w:val="0"/>
-        </w:rPr>
-      </w:r>
-    </w:p>
-    <w:p>
-      <w:pPr>
-        <w:pStyle w:val="Heading1"/>
-        <w:keepNext w:val="0"/>
-        <w:keepLines w:val="0"/>
-        <w:spacing w:before="480" w:lineRule="auto"/>
-        <w:rPr>
-          <w:b w:val="1"/>
-          <w:bCs w:val="1"/>
-          <w:sz w:val="46"/>
-          <w:szCs w:val="46"/>
-        </w:rPr>
-      </w:pPr>
-      <w:bookmarkStart w:colFirst="0" w:colLast="0" w:name="_2sp6rgda5ayh" w:id="14"/>
-      <w:bookmarkEnd w:id="14"/>
-      <w:r>
-        <w:rPr>
-          <w:b w:val="1"/>
-          <w:bCs w:val="1"/>
-          <w:sz w:val="46"/>
-          <w:szCs w:val="46"/>
-          <w:rtl w:val="0"/>
-        </w:rPr>
-        <w:t xml:space="preserve">13. Compatibilidad Arquitectónica</w:t>
-      </w:r>
-    </w:p>
-    <w:p>
-      <w:pPr>
-        <w:spacing w:after="240" w:before="240" w:lineRule="auto"/>
-        <w:rPr/>
-      </w:pPr>
-      <w:r>
-        <w:rPr>
-          <w:rtl w:val="0"/>
-        </w:rPr>
-        <w:t xml:space="preserve">El presente incremento preserva íntegramente las fronteras establecidas por DOC-032.</w:t>
-      </w:r>
-    </w:p>
-    <w:p>
-      <w:pPr>
-        <w:spacing w:after="240" w:before="240" w:lineRule="auto"/>
-        <w:rPr/>
-      </w:pPr>
-      <w:r>
-        <w:rPr>
-          <w:rtl w:val="0"/>
-        </w:rPr>
-        <w:t xml:space="preserve">No modifica:</w:t>
-      </w:r>
-    </w:p>
-    <w:p>
-      <w:pPr>
-        <w:numPr>
-          <w:ilvl w:val="0"/>
-          <w:numId w:val="18"/>
-        </w:numPr>
-        <w:spacing w:after="0" w:afterAutospacing="0" w:before="240" w:lineRule="auto"/>
-        <w:ind w:left="720" w:hanging="360"/>
-      </w:pPr>
-      <w:r>
-        <w:rPr>
-          <w:rtl w:val="0"/>
-        </w:rPr>
-        <w:t xml:space="preserve">Decision Model;</w:t>
-      </w:r>
-    </w:p>
-    <w:p>
-      <w:pPr>
-        <w:numPr>
-          <w:ilvl w:val="0"/>
-          <w:numId w:val="18"/>
-        </w:numPr>
-        <w:spacing w:after="0" w:afterAutospacing="0" w:before="0" w:beforeAutospacing="0" w:lineRule="auto"/>
-        <w:ind w:left="720" w:hanging="360"/>
-      </w:pPr>
-      <w:r>
-        <w:rPr>
-          <w:rtl w:val="0"/>
-        </w:rPr>
-        <w:t xml:space="preserve">Risk;</w:t>
-      </w:r>
-    </w:p>
-    <w:p>
-      <w:pPr>
-        <w:numPr>
-          <w:ilvl w:val="0"/>
-          <w:numId w:val="18"/>
-        </w:numPr>
-        <w:spacing w:after="240" w:before="0" w:beforeAutospacing="0" w:lineRule="auto"/>
-        <w:ind w:left="720" w:hanging="360"/>
-      </w:pPr>
-      <w:r>
-        <w:rPr>
-          <w:rtl w:val="0"/>
-        </w:rPr>
         <w:t xml:space="preserve">Execution.</w:t>
       </w:r>
     </w:p>
@@ -5060,24 +5197,30 @@
     <w:p>
       <w:pPr>
         <w:spacing w:after="240" w:before="240" w:lineRule="auto"/>
-        <w:ind w:left="720" w:firstLine="0"/>
-        <w:rPr/>
-      </w:pPr>
-      <w:r>
-        <w:rPr>
-          <w:rtl w:val="0"/>
-        </w:rPr>
-        <w:t xml:space="preserve">La implementación deberá preservar completamente la compatibilidad arquitectónica con: </w:t>
-      </w:r>
-    </w:p>
-    <w:p>
-      <w:pPr>
-        <w:numPr>
-          <w:ilvl w:val="0"/>
-          <w:numId w:val="15"/>
-        </w:numPr>
-        <w:spacing w:after="0" w:afterAutospacing="0" w:before="240" w:lineRule="auto"/>
-        <w:ind w:left="720" w:hanging="360"/>
+        <w:rPr/>
+      </w:pPr>
+      <w:r>
+        <w:rPr>
+          <w:rtl w:val="0"/>
+        </w:rPr>
+        <w:t xml:space="preserve">La implementación deberá preservar completamente la compatibilidad arquitectónica con:</w:t>
+      </w:r>
+    </w:p>
+    <w:p>
+      <w:pPr>
+        <w:spacing w:after="240" w:before="240" w:lineRule="auto"/>
+        <w:rPr/>
+      </w:pPr>
+      <w:r>
+        <w:rPr>
+          <w:rtl w:val="0"/>
+        </w:rPr>
+      </w:r>
+    </w:p>
+    <w:p>
+      <w:pPr>
+        <w:spacing w:after="240" w:before="240" w:lineRule="auto"/>
+        <w:rPr/>
       </w:pPr>
       <w:r>
         <w:rPr>
@@ -5088,28 +5231,44 @@
     </w:p>
     <w:p>
       <w:pPr>
-        <w:numPr>
-          <w:ilvl w:val="0"/>
-          <w:numId w:val="15"/>
-        </w:numPr>
-        <w:spacing w:after="0" w:afterAutospacing="0" w:before="0" w:beforeAutospacing="0" w:lineRule="auto"/>
-        <w:ind w:left="720" w:hanging="360"/>
-      </w:pPr>
-      <w:r>
-        <w:rPr>
-          <w:rtl w:val="0"/>
-        </w:rPr>
-        <w:t xml:space="preserve"> DecisionProposal; </w:t>
-      </w:r>
-    </w:p>
-    <w:p>
-      <w:pPr>
-        <w:numPr>
-          <w:ilvl w:val="0"/>
-          <w:numId w:val="15"/>
-        </w:numPr>
-        <w:spacing w:after="0" w:afterAutospacing="0" w:before="0" w:beforeAutospacing="0" w:lineRule="auto"/>
-        <w:ind w:left="720" w:hanging="360"/>
+        <w:spacing w:after="240" w:before="240" w:lineRule="auto"/>
+        <w:rPr/>
+      </w:pPr>
+      <w:r>
+        <w:rPr>
+          <w:rtl w:val="0"/>
+        </w:rPr>
+        <w:t xml:space="preserve">InstrumentReference;</w:t>
+      </w:r>
+    </w:p>
+    <w:p>
+      <w:pPr>
+        <w:spacing w:after="240" w:before="240" w:lineRule="auto"/>
+        <w:rPr/>
+      </w:pPr>
+      <w:r>
+        <w:rPr>
+          <w:rtl w:val="0"/>
+        </w:rPr>
+        <w:t xml:space="preserve">CurrencyReference;</w:t>
+      </w:r>
+    </w:p>
+    <w:p>
+      <w:pPr>
+        <w:spacing w:after="240" w:before="240" w:lineRule="auto"/>
+        <w:rPr/>
+      </w:pPr>
+      <w:r>
+        <w:rPr>
+          <w:rtl w:val="0"/>
+        </w:rPr>
+        <w:t xml:space="preserve">DecisionProposal;</w:t>
+      </w:r>
+    </w:p>
+    <w:p>
+      <w:pPr>
+        <w:spacing w:after="240" w:before="240" w:lineRule="auto"/>
+        <w:rPr/>
       </w:pPr>
       <w:r>
         <w:rPr>
@@ -5120,47 +5279,142 @@
     </w:p>
     <w:p>
       <w:pPr>
-        <w:numPr>
-          <w:ilvl w:val="0"/>
-          <w:numId w:val="15"/>
-        </w:numPr>
-        <w:spacing w:after="240" w:before="0" w:beforeAutospacing="0" w:lineRule="auto"/>
-        <w:ind w:left="720" w:hanging="360"/>
-      </w:pPr>
-      <w:r>
-        <w:rPr>
-          <w:rtl w:val="0"/>
-        </w:rPr>
-        <w:t xml:space="preserve"> Portfolio State. </w:t>
-      </w:r>
-      <w:r>
-        <w:rPr>
-          <w:rtl w:val="0"/>
-        </w:rPr>
-      </w:r>
-    </w:p>
-    <w:p>
-      <w:pPr>
-        <w:spacing w:after="240" w:before="240" w:lineRule="auto"/>
-        <w:rPr/>
-      </w:pPr>
-      <w:r>
-        <w:rPr>
-          <w:rtl w:val="0"/>
-        </w:rPr>
-        <w:t xml:space="preserve">No podrá introducir dependencias adicionales.</w:t>
-      </w:r>
-    </w:p>
-    <w:p>
-      <w:pPr>
-        <w:spacing w:after="240" w:before="240" w:lineRule="auto"/>
-        <w:rPr/>
-      </w:pPr>
-      <w:r>
-        <w:rPr>
-          <w:rtl w:val="0"/>
-        </w:rPr>
-        <w:t xml:space="preserve">No podrá modificar contratos existentes.</w:t>
+        <w:spacing w:after="240" w:before="240" w:lineRule="auto"/>
+        <w:rPr/>
+      </w:pPr>
+      <w:r>
+        <w:rPr>
+          <w:rtl w:val="0"/>
+        </w:rPr>
+        <w:t xml:space="preserve">Portfolio State.</w:t>
+      </w:r>
+    </w:p>
+    <w:p>
+      <w:pPr>
+        <w:spacing w:after="240" w:before="240" w:lineRule="auto"/>
+        <w:rPr/>
+      </w:pPr>
+      <w:r>
+        <w:rPr>
+          <w:rtl w:val="0"/>
+        </w:rPr>
+      </w:r>
+    </w:p>
+    <w:p>
+      <w:pPr>
+        <w:spacing w:after="240" w:before="240" w:lineRule="auto"/>
+        <w:rPr/>
+      </w:pPr>
+      <w:r>
+        <w:rPr>
+          <w:rtl w:val="0"/>
+        </w:rPr>
+        <w:t xml:space="preserve">Portfolio dependerá exclusivamente de las exportaciones públicas autorizadas de IT-REF-001.</w:t>
+      </w:r>
+    </w:p>
+    <w:p>
+      <w:pPr>
+        <w:spacing w:after="240" w:before="240" w:lineRule="auto"/>
+        <w:rPr/>
+      </w:pPr>
+      <w:r>
+        <w:rPr>
+          <w:rtl w:val="0"/>
+        </w:rPr>
+      </w:r>
+    </w:p>
+    <w:p>
+      <w:pPr>
+        <w:spacing w:after="240" w:before="240" w:lineRule="auto"/>
+        <w:rPr/>
+      </w:pPr>
+      <w:r>
+        <w:rPr>
+          <w:rtl w:val="0"/>
+        </w:rPr>
+        <w:t xml:space="preserve">No podrá:</w:t>
+      </w:r>
+    </w:p>
+    <w:p>
+      <w:pPr>
+        <w:spacing w:after="240" w:before="240" w:lineRule="auto"/>
+        <w:rPr/>
+      </w:pPr>
+      <w:r>
+        <w:rPr>
+          <w:rtl w:val="0"/>
+        </w:rPr>
+      </w:r>
+    </w:p>
+    <w:p>
+      <w:pPr>
+        <w:spacing w:after="240" w:before="240" w:lineRule="auto"/>
+        <w:rPr/>
+      </w:pPr>
+      <w:r>
+        <w:rPr>
+          <w:rtl w:val="0"/>
+        </w:rPr>
+        <w:t xml:space="preserve">modificar InstrumentReference;</w:t>
+      </w:r>
+    </w:p>
+    <w:p>
+      <w:pPr>
+        <w:spacing w:after="240" w:before="240" w:lineRule="auto"/>
+        <w:rPr/>
+      </w:pPr>
+      <w:r>
+        <w:rPr>
+          <w:rtl w:val="0"/>
+        </w:rPr>
+        <w:t xml:space="preserve">modificar CurrencyReference;</w:t>
+      </w:r>
+    </w:p>
+    <w:p>
+      <w:pPr>
+        <w:spacing w:after="240" w:before="240" w:lineRule="auto"/>
+        <w:rPr/>
+      </w:pPr>
+      <w:r>
+        <w:rPr>
+          <w:rtl w:val="0"/>
+        </w:rPr>
+        <w:t xml:space="preserve">introducir referencias alternativas;</w:t>
+      </w:r>
+    </w:p>
+    <w:p>
+      <w:pPr>
+        <w:spacing w:after="240" w:before="240" w:lineRule="auto"/>
+        <w:rPr/>
+      </w:pPr>
+      <w:r>
+        <w:rPr>
+          <w:rtl w:val="0"/>
+        </w:rPr>
+        <w:t xml:space="preserve">introducir dependencias adicionales;</w:t>
+      </w:r>
+    </w:p>
+    <w:p>
+      <w:pPr>
+        <w:spacing w:after="240" w:before="240" w:lineRule="auto"/>
+        <w:rPr/>
+      </w:pPr>
+      <w:r>
+        <w:rPr>
+          <w:rtl w:val="0"/>
+        </w:rPr>
+        <w:t xml:space="preserve">modificar contratos existentes.</w:t>
+      </w:r>
+    </w:p>
+    <w:p>
+      <w:pPr>
+        <w:spacing w:after="240" w:before="240" w:lineRule="auto"/>
+        <w:rPr/>
+      </w:pPr>
+      <w:r>
+        <w:rPr>
+          <w:rtl w:val="0"/>
+        </w:rPr>
       </w:r>
     </w:p>
     <w:p>
@@ -8718,123 +8972,154 @@
           <w:rtl w:val="0"/>
         </w:rPr>
         <w:br w:type="textWrapping"/>
-        <w:t xml:space="preserve">22. Dependencias Contractuales Pendientes de Verificación</w:t>
-      </w:r>
-    </w:p>
-    <w:p>
-      <w:pPr>
-        <w:rPr/>
-      </w:pPr>
-      <w:r>
-        <w:rPr>
-          <w:rtl w:val="0"/>
-        </w:rPr>
-      </w:r>
-    </w:p>
-    <w:p>
-      <w:pPr>
-        <w:rPr/>
-      </w:pPr>
-      <w:r>
-        <w:rPr>
-          <w:rtl w:val="0"/>
-        </w:rPr>
-        <w:t xml:space="preserve">Antes de iniciar la implementación deberá verificarse factual y documentalmente la existencia de contratos públicos autorizados para:</w:t>
-      </w:r>
-    </w:p>
-    <w:p>
-      <w:pPr>
-        <w:rPr/>
-      </w:pPr>
-      <w:r>
-        <w:rPr>
-          <w:rtl w:val="0"/>
-        </w:rPr>
-      </w:r>
-    </w:p>
-    <w:p>
-      <w:pPr>
-        <w:rPr/>
-      </w:pPr>
-      <w:r>
-        <w:rPr>
-          <w:rtl w:val="0"/>
-        </w:rPr>
-        <w:t xml:space="preserve">identidad de instrumento;</w:t>
-      </w:r>
-    </w:p>
-    <w:p>
-      <w:pPr>
-        <w:rPr/>
-      </w:pPr>
-      <w:r>
-        <w:rPr>
-          <w:rtl w:val="0"/>
-        </w:rPr>
-        <w:t xml:space="preserve">identidad de moneda.</w:t>
-      </w:r>
-    </w:p>
-    <w:p>
-      <w:pPr>
-        <w:rPr/>
-      </w:pPr>
-      <w:r>
-        <w:rPr>
-          <w:rtl w:val="0"/>
-        </w:rPr>
-      </w:r>
-    </w:p>
-    <w:p>
-      <w:pPr>
-        <w:rPr/>
-      </w:pPr>
-      <w:r>
-        <w:rPr>
-          <w:rtl w:val="0"/>
-        </w:rPr>
-        <w:t xml:space="preserve">La implementación deberá reutilizar dichos contratos cuando existan.</w:t>
-      </w:r>
-    </w:p>
-    <w:p>
-      <w:pPr>
-        <w:rPr/>
-      </w:pPr>
-      <w:r>
-        <w:rPr>
-          <w:rtl w:val="0"/>
-        </w:rPr>
-      </w:r>
-    </w:p>
-    <w:p>
-      <w:pPr>
-        <w:rPr/>
-      </w:pPr>
-      <w:r>
-        <w:rPr>
-          <w:rtl w:val="0"/>
-        </w:rPr>
-        <w:t xml:space="preserve">Si alguno de los contratos requeridos no existe, el Agente de Implementación deberá detenerse antes de modificar código y reportar la dependencia faltante.</w:t>
-      </w:r>
-    </w:p>
-    <w:p>
-      <w:pPr>
-        <w:rPr/>
-      </w:pPr>
-      <w:r>
-        <w:rPr>
-          <w:rtl w:val="0"/>
-        </w:rPr>
-      </w:r>
-    </w:p>
-    <w:p>
-      <w:pPr>
-        <w:rPr/>
-      </w:pPr>
-      <w:r>
-        <w:rPr>
-          <w:rtl w:val="0"/>
-        </w:rPr>
-        <w:t xml:space="preserve">El Agente de Implementación no está autorizado para sustituir dichos contratos mediante:</w:t>
+        <w:t xml:space="preserve">22. Dependencias Contractuales Satisfechas </w:t>
+      </w:r>
+    </w:p>
+    <w:p>
+      <w:pPr>
+        <w:rPr/>
+      </w:pPr>
+      <w:r>
+        <w:rPr>
+          <w:rtl w:val="0"/>
+        </w:rPr>
+      </w:r>
+    </w:p>
+    <w:p>
+      <w:pPr>
+        <w:rPr/>
+      </w:pPr>
+      <w:r>
+        <w:rPr>
+          <w:rtl w:val="0"/>
+        </w:rPr>
+        <w:t xml:space="preserve">Las dependencias contractuales necesarias para representar las posiciones y disponibilidades monetarias de Portfolio State han sido satisfechas mediante:</w:t>
+      </w:r>
+    </w:p>
+    <w:p>
+      <w:pPr>
+        <w:rPr/>
+      </w:pPr>
+      <w:r>
+        <w:rPr>
+          <w:rtl w:val="0"/>
+        </w:rPr>
+      </w:r>
+    </w:p>
+    <w:p>
+      <w:pPr>
+        <w:rPr/>
+      </w:pPr>
+      <w:r>
+        <w:rPr>
+          <w:rtl w:val="0"/>
+        </w:rPr>
+        <w:t xml:space="preserve">IT-REF-001 — Reference Identity Domain Contracts MVP.</w:t>
+      </w:r>
+    </w:p>
+    <w:p>
+      <w:pPr>
+        <w:rPr/>
+      </w:pPr>
+      <w:r>
+        <w:rPr>
+          <w:rtl w:val="0"/>
+        </w:rPr>
+      </w:r>
+    </w:p>
+    <w:p>
+      <w:pPr>
+        <w:rPr/>
+      </w:pPr>
+      <w:r>
+        <w:rPr>
+          <w:rtl w:val="0"/>
+        </w:rPr>
+        <w:t xml:space="preserve">Las posiciones utilizarán InstrumentReference como referencia pública, tipada, canónica e inequívoca de instrumento.</w:t>
+      </w:r>
+    </w:p>
+    <w:p>
+      <w:pPr>
+        <w:rPr/>
+      </w:pPr>
+      <w:r>
+        <w:rPr>
+          <w:rtl w:val="0"/>
+        </w:rPr>
+      </w:r>
+    </w:p>
+    <w:p>
+      <w:pPr>
+        <w:rPr/>
+      </w:pPr>
+      <w:r>
+        <w:rPr>
+          <w:rtl w:val="0"/>
+        </w:rPr>
+        <w:t xml:space="preserve">Las disponibilidades monetarias utilizarán CurrencyReference como referencia pública, tipada, canónica e inequívoca de moneda.</w:t>
+      </w:r>
+    </w:p>
+    <w:p>
+      <w:pPr>
+        <w:rPr/>
+      </w:pPr>
+      <w:r>
+        <w:rPr>
+          <w:rtl w:val="0"/>
+        </w:rPr>
+      </w:r>
+    </w:p>
+    <w:p>
+      <w:pPr>
+        <w:rPr/>
+      </w:pPr>
+      <w:r>
+        <w:rPr>
+          <w:rtl w:val="0"/>
+        </w:rPr>
+        <w:t xml:space="preserve">IT-032-001 no redefinirá, extenderá ni sustituirá dichos contratos.</w:t>
+      </w:r>
+    </w:p>
+    <w:p>
+      <w:pPr>
+        <w:rPr/>
+      </w:pPr>
+      <w:r>
+        <w:rPr>
+          <w:rtl w:val="0"/>
+        </w:rPr>
+      </w:r>
+    </w:p>
+    <w:p>
+      <w:pPr>
+        <w:rPr/>
+      </w:pPr>
+      <w:r>
+        <w:rPr>
+          <w:rtl w:val="0"/>
+        </w:rPr>
+        <w:t xml:space="preserve">Portfolio dependerá exclusivamente de sus exportaciones públicas autorizadas.</w:t>
+      </w:r>
+    </w:p>
+    <w:p>
+      <w:pPr>
+        <w:rPr/>
+      </w:pPr>
+      <w:r>
+        <w:rPr>
+          <w:rtl w:val="0"/>
+        </w:rPr>
+      </w:r>
+    </w:p>
+    <w:p>
+      <w:pPr>
+        <w:rPr/>
+      </w:pPr>
+      <w:r>
+        <w:rPr>
+          <w:rtl w:val="0"/>
+        </w:rPr>
+        <w:t xml:space="preserve">La implementación no utilizará:</w:t>
       </w:r>
     </w:p>
     <w:p>
@@ -8899,39 +9184,49 @@
         <w:rPr>
           <w:rtl w:val="0"/>
         </w:rPr>
-        <w:t xml:space="preserve">wrappers nominales sin semántica aprobada;</w:t>
-      </w:r>
-    </w:p>
-    <w:p>
-      <w:pPr>
-        <w:rPr/>
-      </w:pPr>
-      <w:r>
-        <w:rPr>
-          <w:rtl w:val="0"/>
-        </w:rPr>
-        <w:t xml:space="preserve">identificadores inventados localmente.</w:t>
-      </w:r>
-    </w:p>
-    <w:p>
-      <w:pPr>
-        <w:rPr/>
-      </w:pPr>
-      <w:r>
-        <w:rPr>
-          <w:rtl w:val="0"/>
-        </w:rPr>
-      </w:r>
-    </w:p>
-    <w:p>
-      <w:pPr>
-        <w:rPr/>
-      </w:pPr>
-      <w:r>
-        <w:rPr>
-          <w:rtl w:val="0"/>
-        </w:rPr>
-        <w:t xml:space="preserve">La ausencia de alguno de estos contratos constituye un bloqueo contractual localizado y no autoriza modificar unilateralmente el alcance de IT-032-001.</w:t>
+        <w:t xml:space="preserve">wrappers locales;</w:t>
+      </w:r>
+    </w:p>
+    <w:p>
+      <w:pPr>
+        <w:rPr/>
+      </w:pPr>
+      <w:r>
+        <w:rPr>
+          <w:rtl w:val="0"/>
+        </w:rPr>
+        <w:t xml:space="preserve">identificadores alternativos pertenecientes a Portfolio.</w:t>
+      </w:r>
+    </w:p>
+    <w:p>
+      <w:pPr>
+        <w:rPr/>
+      </w:pPr>
+      <w:r>
+        <w:rPr>
+          <w:rtl w:val="0"/>
+        </w:rPr>
+      </w:r>
+    </w:p>
+    <w:p>
+      <w:pPr>
+        <w:rPr/>
+      </w:pPr>
+      <w:r>
+        <w:rPr>
+          <w:rtl w:val="0"/>
+        </w:rPr>
+        <w:t xml:space="preserve">La implementación de IT-032-001 queda desbloqueada respecto de las identidades públicas de instrumento y moneda.</w:t>
+      </w:r>
+    </w:p>
+    <w:p>
+      <w:pPr>
+        <w:rPr/>
+      </w:pPr>
+      <w:r>
+        <w:rPr>
+          <w:rtl w:val="0"/>
+        </w:rPr>
       </w:r>
     </w:p>
     <w:p>
@@ -10606,226 +10901,6 @@
     </w:lvl>
   </w:abstractNum>
   <w:abstractNum w:abstractNumId="16">
-    <w:lvl w:ilvl="0">
-      <w:start w:val="1"/>
-      <w:numFmt w:val="bullet"/>
-      <w:lvlText w:val="●"/>
-      <w:lvlJc w:val="left"/>
-      <w:pPr>
-        <w:ind w:left="720" w:hanging="360"/>
-      </w:pPr>
-      <w:rPr>
-        <w:u w:val="none"/>
-      </w:rPr>
-    </w:lvl>
-    <w:lvl w:ilvl="1">
-      <w:start w:val="1"/>
-      <w:numFmt w:val="bullet"/>
-      <w:lvlText w:val="○"/>
-      <w:lvlJc w:val="left"/>
-      <w:pPr>
-        <w:ind w:left="1440" w:hanging="360"/>
-      </w:pPr>
-      <w:rPr>
-        <w:u w:val="none"/>
-      </w:rPr>
-    </w:lvl>
-    <w:lvl w:ilvl="2">
-      <w:start w:val="1"/>
-      <w:numFmt w:val="bullet"/>
-      <w:lvlText w:val="■"/>
-      <w:lvlJc w:val="left"/>
-      <w:pPr>
-        <w:ind w:left="2160" w:hanging="360"/>
-      </w:pPr>
-      <w:rPr>
-        <w:u w:val="none"/>
-      </w:rPr>
-    </w:lvl>
-    <w:lvl w:ilvl="3">
-      <w:start w:val="1"/>
-      <w:numFmt w:val="bullet"/>
-      <w:lvlText w:val="●"/>
-      <w:lvlJc w:val="left"/>
-      <w:pPr>
-        <w:ind w:left="2880" w:hanging="360"/>
-      </w:pPr>
-      <w:rPr>
-        <w:u w:val="none"/>
-      </w:rPr>
-    </w:lvl>
-    <w:lvl w:ilvl="4">
-      <w:start w:val="1"/>
-      <w:numFmt w:val="bullet"/>
-      <w:lvlText w:val="○"/>
-      <w:lvlJc w:val="left"/>
-      <w:pPr>
-        <w:ind w:left="3600" w:hanging="360"/>
-      </w:pPr>
-      <w:rPr>
-        <w:u w:val="none"/>
-      </w:rPr>
-    </w:lvl>
-    <w:lvl w:ilvl="5">
-      <w:start w:val="1"/>
-      <w:numFmt w:val="bullet"/>
-      <w:lvlText w:val="■"/>
-      <w:lvlJc w:val="left"/>
-      <w:pPr>
-        <w:ind w:left="4320" w:hanging="360"/>
-      </w:pPr>
-      <w:rPr>
-        <w:u w:val="none"/>
-      </w:rPr>
-    </w:lvl>
-    <w:lvl w:ilvl="6">
-      <w:start w:val="1"/>
-      <w:numFmt w:val="bullet"/>
-      <w:lvlText w:val="●"/>
-      <w:lvlJc w:val="left"/>
-      <w:pPr>
-        <w:ind w:left="5040" w:hanging="360"/>
-      </w:pPr>
-      <w:rPr>
-        <w:u w:val="none"/>
-      </w:rPr>
-    </w:lvl>
-    <w:lvl w:ilvl="7">
-      <w:start w:val="1"/>
-      <w:numFmt w:val="bullet"/>
-      <w:lvlText w:val="○"/>
-      <w:lvlJc w:val="left"/>
-      <w:pPr>
-        <w:ind w:left="5760" w:hanging="360"/>
-      </w:pPr>
-      <w:rPr>
-        <w:u w:val="none"/>
-      </w:rPr>
-    </w:lvl>
-    <w:lvl w:ilvl="8">
-      <w:start w:val="1"/>
-      <w:numFmt w:val="bullet"/>
-      <w:lvlText w:val="■"/>
-      <w:lvlJc w:val="left"/>
-      <w:pPr>
-        <w:ind w:left="6480" w:hanging="360"/>
-      </w:pPr>
-      <w:rPr>
-        <w:u w:val="none"/>
-      </w:rPr>
-    </w:lvl>
-  </w:abstractNum>
-  <w:abstractNum w:abstractNumId="17">
-    <w:lvl w:ilvl="0">
-      <w:start w:val="1"/>
-      <w:numFmt w:val="bullet"/>
-      <w:lvlText w:val="●"/>
-      <w:lvlJc w:val="left"/>
-      <w:pPr>
-        <w:ind w:left="720" w:hanging="360"/>
-      </w:pPr>
-      <w:rPr>
-        <w:u w:val="none"/>
-      </w:rPr>
-    </w:lvl>
-    <w:lvl w:ilvl="1">
-      <w:start w:val="1"/>
-      <w:numFmt w:val="bullet"/>
-      <w:lvlText w:val="○"/>
-      <w:lvlJc w:val="left"/>
-      <w:pPr>
-        <w:ind w:left="1440" w:hanging="360"/>
-      </w:pPr>
-      <w:rPr>
-        <w:u w:val="none"/>
-      </w:rPr>
-    </w:lvl>
-    <w:lvl w:ilvl="2">
-      <w:start w:val="1"/>
-      <w:numFmt w:val="bullet"/>
-      <w:lvlText w:val="■"/>
-      <w:lvlJc w:val="left"/>
-      <w:pPr>
-        <w:ind w:left="2160" w:hanging="360"/>
-      </w:pPr>
-      <w:rPr>
-        <w:u w:val="none"/>
-      </w:rPr>
-    </w:lvl>
-    <w:lvl w:ilvl="3">
-      <w:start w:val="1"/>
-      <w:numFmt w:val="bullet"/>
-      <w:lvlText w:val="●"/>
-      <w:lvlJc w:val="left"/>
-      <w:pPr>
-        <w:ind w:left="2880" w:hanging="360"/>
-      </w:pPr>
-      <w:rPr>
-        <w:u w:val="none"/>
-      </w:rPr>
-    </w:lvl>
-    <w:lvl w:ilvl="4">
-      <w:start w:val="1"/>
-      <w:numFmt w:val="bullet"/>
-      <w:lvlText w:val="○"/>
-      <w:lvlJc w:val="left"/>
-      <w:pPr>
-        <w:ind w:left="3600" w:hanging="360"/>
-      </w:pPr>
-      <w:rPr>
-        <w:u w:val="none"/>
-      </w:rPr>
-    </w:lvl>
-    <w:lvl w:ilvl="5">
-      <w:start w:val="1"/>
-      <w:numFmt w:val="bullet"/>
-      <w:lvlText w:val="■"/>
-      <w:lvlJc w:val="left"/>
-      <w:pPr>
-        <w:ind w:left="4320" w:hanging="360"/>
-      </w:pPr>
-      <w:rPr>
-        <w:u w:val="none"/>
-      </w:rPr>
-    </w:lvl>
-    <w:lvl w:ilvl="6">
-      <w:start w:val="1"/>
-      <w:numFmt w:val="bullet"/>
-      <w:lvlText w:val="●"/>
-      <w:lvlJc w:val="left"/>
-      <w:pPr>
-        <w:ind w:left="5040" w:hanging="360"/>
-      </w:pPr>
-      <w:rPr>
-        <w:u w:val="none"/>
-      </w:rPr>
-    </w:lvl>
-    <w:lvl w:ilvl="7">
-      <w:start w:val="1"/>
-      <w:numFmt w:val="bullet"/>
-      <w:lvlText w:val="○"/>
-      <w:lvlJc w:val="left"/>
-      <w:pPr>
-        <w:ind w:left="5760" w:hanging="360"/>
-      </w:pPr>
-      <w:rPr>
-        <w:u w:val="none"/>
-      </w:rPr>
-    </w:lvl>
-    <w:lvl w:ilvl="8">
-      <w:start w:val="1"/>
-      <w:numFmt w:val="bullet"/>
-      <w:lvlText w:val="■"/>
-      <w:lvlJc w:val="left"/>
-      <w:pPr>
-        <w:ind w:left="6480" w:hanging="360"/>
-      </w:pPr>
-      <w:rPr>
-        <w:u w:val="none"/>
-      </w:rPr>
-    </w:lvl>
-  </w:abstractNum>
-  <w:abstractNum w:abstractNumId="18">
     <w:lvl w:ilvl="0">
       <w:start w:val="1"/>
       <w:numFmt w:val="bullet"/>
@@ -10982,12 +11057,6 @@
   </w:num>
   <w:num w:numId="16">
     <w:abstractNumId w:val="16"/>
-  </w:num>
-  <w:num w:numId="17">
-    <w:abstractNumId w:val="17"/>
-  </w:num>
-  <w:num w:numId="18">
-    <w:abstractNumId w:val="18"/>
   </w:num>
 </w:numbering>
 </file>

</xml_diff>